<commit_message>
Adjust RIIM budget to output-based funding (Rp150-200jt per output).
Recalibrate annual budgets to Rp400-450jt for the 1 KTI + 1 KI + 1 model package, totaling Rp1.25B over 3 years, and scale sampling plans accordingly.

Co-authored-by: dr-psud <dr-psud@users.noreply.github.com>
</commit_message>
<xml_diff>
--- a/proposal-riim/PROPOSAL_RIIM_Domba_Temanggung.docx
+++ b/proposal-riim/PROPOSAL_RIIM_Domba_Temanggung.docx
@@ -569,7 +569,7 @@
           <w:b w:val="0"/>
           <w:sz w:val="24"/>
         </w:rPr>
-        <w:t>Tahun 1: Rp750.000.000; Tahun 2: Rp800.000.000; Tahun 3: Rp650.000.000; Total: Rp2.200.000.000 (dana pendamping Rp0).</w:t>
+        <w:t>Tahun 1: Rp400.000.000; Tahun 2: Rp450.000.000; Tahun 3: Rp400.000.000; Total: Rp1.250.000.000 (dana pendamping Rp0). Disusun berbasis kesetaraan output: 1 keluaran ≈ Rp150–200 juta; paket 1 KTI + 1 KI + 1 model ≈ Rp300–450 juta/tahun.</w:t>
       </w:r>
     </w:p>
     <w:p>
@@ -1140,7 +1140,7 @@
           <w:b w:val="0"/>
           <w:sz w:val="24"/>
         </w:rPr>
-        <w:t>Tahun 1 — Fondasi fenotip &amp; data omik: standar fenotip; koleksi sampel ≥200 ekor; genotyping tahap I; metabolom subset; draft manuskrip 1; draft KI.</w:t>
+        <w:t>Tahun 1 — Fondasi fenotip &amp; data omik: standar fenotip; koleksi sampel ≥100 ekor; genotyping tahap I; metabolom subset; draft manuskrip 1; draft KI.</w:t>
       </w:r>
     </w:p>
     <w:p>
@@ -1243,7 +1243,7 @@
           <w:b w:val="0"/>
           <w:sz w:val="24"/>
         </w:rPr>
-        <w:t>Lokasi: Kabupaten Temanggung, Jawa Tengah. Mitra: DKPPP Temanggung dan komunitas DSL/peternak. Target sampel genomik minimal 200 ekor (ideal 240–300), seimbang Teropong : non-Teropong, mempertimbangkan jenis kelamin dan kelas umur. Subset metabolomik 60–100 ekor terpilih berdasarkan kontras fenotip/performa, distandardisasi sampling.</w:t>
+        <w:t>Lokasi: Kabupaten Temanggung, Jawa Tengah. Mitra: DKPPP Temanggung dan komunitas DSL/peternak. Target sampel genomik 100–150 ekor, seimbang Teropong : non-Teropong, dengan penambahan bertahap sesuai tahun pendanaan. Subset metabolomik 30–50 ekor terpilih berdasarkan kontras fenotip/performa, distandardisasi sampling.</w:t>
       </w:r>
     </w:p>
     <w:p>
@@ -1427,7 +1427,7 @@
           <w:b w:val="0"/>
           <w:sz w:val="24"/>
         </w:rPr>
-        <w:t>Tahun 1: 1 publikasi minimal Q3 under review; draft paten sederhana/KI; database fenotip ≥200 ekor + biobank; draft standar fenotip galur.</w:t>
+        <w:t>Tahun 1: 1 publikasi minimal Q3 under review; draft paten sederhana/KI; database fenotip ≥100 ekor + biobank; draft standar fenotip galur.</w:t>
       </w:r>
     </w:p>
     <w:p>
@@ -1533,7 +1533,7 @@
           <w:b w:val="0"/>
           <w:sz w:val="24"/>
         </w:rPr>
-        <w:t>Proporsi mengikuti Juknis RIIM: Biaya Langsung Personil ≤25%; Biaya Langsung Non-Personil ≥70%; Biaya Tidak Langsung ≤5%.</w:t>
+        <w:t>Pendanaan mengikuti prinsip kesetaraan output: 1 keluaran ≈ Rp150–200 juta. Paket tahunan 1 KTI + 1 KI + 1 model/implementasi dianggarkan pada rentang Rp300–450 juta/tahun.</w:t>
       </w:r>
     </w:p>
     <w:p>
@@ -1547,7 +1547,7 @@
           <w:b w:val="0"/>
           <w:sz w:val="24"/>
         </w:rPr>
-        <w:t>Tahun 1 Rp750.000.000 (Personil 180 jt; Non-personil 540 jt; Tidak langsung 30 jt).</w:t>
+        <w:t>Proporsi mengikuti Juknis RIIM: Biaya Langsung Personil ≤25%; Biaya Langsung Non-Personil ≥70%; Biaya Tidak Langsung ≤5%.</w:t>
       </w:r>
     </w:p>
     <w:p>
@@ -1561,7 +1561,7 @@
           <w:b w:val="0"/>
           <w:sz w:val="24"/>
         </w:rPr>
-        <w:t>Tahun 2 Rp800.000.000 (Personil 180 jt; Non-personil 580 jt; Tidak langsung 40 jt).</w:t>
+        <w:t>Tahun 1 Rp400.000.000 (Personil 90 jt; Non-personil 290 jt; Tidak langsung 20 jt) untuk 1 KTI under review + 1 draft KI + 1 draft model.</w:t>
       </w:r>
     </w:p>
     <w:p>
@@ -1575,7 +1575,7 @@
           <w:b w:val="0"/>
           <w:sz w:val="24"/>
         </w:rPr>
-        <w:t>Tahun 3 Rp650.000.000 (Personil 150 jt; Non-personil 470 jt; Tidak langsung 30 jt).</w:t>
+        <w:t>Tahun 2 Rp450.000.000 (Personil 100 jt; Non-personil 328 jt; Tidak langsung 22 jt) untuk 1 KTI baru under review + 1 KI terdaftar + 1 model seleksi.</w:t>
       </w:r>
     </w:p>
     <w:p>
@@ -1589,7 +1589,21 @@
           <w:b w:val="0"/>
           <w:sz w:val="24"/>
         </w:rPr>
-        <w:t>Total usulan Rp2.200.000.000. RAB detail per item dilampirkan pada lembar RAB resmi sistem Pendanaan Risnov, termasuk pemisahan harga pokok dan pajak sesuai status PKP/Non-PKP institusi.</w:t>
+        <w:t>Tahun 3 Rp400.000.000 (Personil 90 jt; Non-personil 290 jt; Tidak langsung 20 jt) untuk 1 KTI baru under review + 1 KI tambahan + 1 implementasi/rekomendasi teknis.</w:t>
+      </w:r>
+    </w:p>
+    <w:p>
+      <w:pPr>
+        <w:spacing w:after="120" w:line="276" w:lineRule="auto"/>
+        <w:jc w:val="both"/>
+      </w:pPr>
+      <w:r>
+        <w:rPr>
+          <w:rFonts w:ascii="Times New Roman" w:hAnsi="Times New Roman"/>
+          <w:b w:val="0"/>
+          <w:sz w:val="24"/>
+        </w:rPr>
+        <w:t>Total usulan Rp1.250.000.000. Status accepted/published KTI tahun sebelumnya merupakan akumulasi kewajiban RIIM dan tidak dihitung sebagai keluaran baru untuk penambahan plafon dana. RAB detail per item dilampirkan pada lembar RAB resmi sistem Pendanaan Risnov, termasuk pemisahan harga pokok dan pajak sesuai status PKP/Non-PKP institusi.</w:t>
       </w:r>
     </w:p>
     <w:p>

</xml_diff>

<commit_message>
Update proposal title to recommended genomics-metabolomics formulation.
Retitle around Teropong phenotype, production, and reproduction traits for Temanggung sheep breed development supporting national food security, and align body terminology accordingly.

Co-authored-by: dr-psud <dr-psud@users.noreply.github.com>
</commit_message>
<xml_diff>
--- a/proposal-riim/PROPOSAL_RIIM_Domba_Temanggung.docx
+++ b/proposal-riim/PROPOSAL_RIIM_Domba_Temanggung.docx
@@ -92,7 +92,7 @@
           <w:b/>
           <w:sz w:val="24"/>
         </w:rPr>
-        <w:t>Genomik dan Metabolomik Fenotip Teropong, Sifat Produksi,</w:t>
+        <w:t>Integrasi Genomik dan Metabolomik pada Fenotip Teropong,</w:t>
       </w:r>
     </w:p>
     <w:p>
@@ -105,7 +105,7 @@
           <w:b/>
           <w:sz w:val="24"/>
         </w:rPr>
-        <w:t>serta Proliferasi Domba Temanggung sebagai Basis</w:t>
+        <w:t>Sifat Produksi, dan Reproduksi sebagai Basis Penggaluran</w:t>
       </w:r>
     </w:p>
     <w:p>
@@ -118,7 +118,7 @@
           <w:b/>
           <w:sz w:val="24"/>
         </w:rPr>
-        <w:t>Penggaluran Bibit Unggul untuk Ketahanan Pangan</w:t>
+        <w:t>Bibit Unggul Domba Temanggung untuk Ketahanan Pangan Nasional</w:t>
       </w:r>
     </w:p>
     <w:p/>
@@ -287,7 +287,7 @@
         </w:rPr>
         <w:t>2. Judul Proposal</w:t>
         <w:tab/>
-        <w:t>: Genomik dan Metabolomik Fenotip Teropong, Sifat Produksi, serta Proliferasi Domba Temanggung sebagai Basis Penggaluran Bibit Unggul untuk Ketahanan Pangan</w:t>
+        <w:t>: Integrasi Genomik dan Metabolomik pada Fenotip Teropong, Sifat Produksi, dan Reproduksi sebagai Basis Penggaluran Bibit Unggul Domba Temanggung untuk Ketahanan Pangan Nasional</w:t>
       </w:r>
     </w:p>
     <w:p>
@@ -694,7 +694,7 @@
           <w:b w:val="0"/>
           <w:sz w:val="24"/>
         </w:rPr>
-        <w:t>Genomik dan Metabolomik Fenotip Teropong, Sifat Produksi, serta Proliferasi Domba Temanggung sebagai Basis Penggaluran Bibit Unggul untuk Ketahanan Pangan</w:t>
+        <w:t>Integrasi Genomik dan Metabolomik pada Fenotip Teropong, Sifat Produksi, dan Reproduksi sebagai Basis Penggaluran Bibit Unggul Domba Temanggung untuk Ketahanan Pangan Nasional</w:t>
       </w:r>
     </w:p>
     <w:p>
@@ -719,7 +719,7 @@
           <w:b w:val="0"/>
           <w:sz w:val="24"/>
         </w:rPr>
-        <w:t>Domba Temanggung merupakan plasma nutfah lokal Jawa Tengah dengan ciri khas fenotip teropong (warna bulu hitam melingkar di sekitar mata), yang saat ini diusulkan sebagai identitas galur/rumpun lokal unggul. Namun, diferensiasi galur Teropong versus non-Teropong masih bertumpu pada deskripsi fenotipik visual dan data genetik maternal terbatas (mtDNA), sehingga belum tersedia bukti genomik nuklear maupun profil metabolomik yang mendukung penggaluran berbasis sains. Riset ini mengintegrasikan pendekatan genomik (GWAS dan signatures of selection) serta metabolomik untuk mengarakterisasi fenotip Teropong, sifat produksi (bobot badan dan morfometri), serta proliferasi Domba Temanggung sebagai basis penggaluran bibit unggul. Populasi studi dirancang case–control dan kuantitatif pada Domba Temanggung di Kabupaten Temanggung dengan mitra DKPPP dan komunitas peternak. Kegiatan meliputi standardisasi fenotip, genotyping/whole-genome sequencing, asosiasi genom–fenotip, deteksi jejak seleksi, profil metabolom serum/jaringan terkait, serta integrasi multi-omik untuk menghasilkan panel marka dan model seleksi. Luaran utama mencakup publikasi jurnal internasional bereputasi, kekayaan intelektual (panel marka/paten sederhana), dan rekomendasi teknis penggaluran yang dapat memperkuat penyediaan bibit lokal unggul dan mendukung ketahanan pangan berbasis protein hewani.</w:t>
+        <w:t>Domba Temanggung merupakan plasma nutfah lokal Jawa Tengah dengan ciri khas fenotip teropong (warna bulu hitam melingkar di sekitar mata), yang saat ini diusulkan sebagai identitas galur/rumpun lokal unggul. Namun, diferensiasi galur Teropong versus non-Teropong masih bertumpu pada deskripsi fenotipik visual dan data genetik maternal terbatas (mtDNA), sehingga belum tersedia bukti genomik nuklear maupun profil metabolomik yang mendukung penggaluran berbasis sains. Riset ini mengintegrasikan pendekatan genomik (GWAS dan signatures of selection) serta metabolomik untuk mengarakterisasi fenotip Teropong, sifat produksi (bobot badan dan morfometri), serta reproduksi Domba Temanggung sebagai basis penggaluran bibit unggul. Populasi studi dirancang case–control dan kuantitatif pada Domba Temanggung di Kabupaten Temanggung dengan mitra DKPPP dan komunitas peternak. Kegiatan meliputi standardisasi fenotip, genotyping/whole-genome sequencing, asosiasi genom–fenotip, deteksi jejak seleksi, profil metabolom serum/jaringan terkait, serta integrasi multi-omik untuk menghasilkan panel marka dan model seleksi. Luaran utama mencakup publikasi jurnal internasional bereputasi, kekayaan intelektual (panel marka/paten sederhana), dan rekomendasi teknis penggaluran yang dapat memperkuat penyediaan bibit lokal unggul dan mendukung ketahanan pangan berbasis protein hewani.</w:t>
       </w:r>
     </w:p>
     <w:p>
@@ -733,7 +733,7 @@
           <w:b w:val="0"/>
           <w:sz w:val="24"/>
         </w:rPr>
-        <w:t>Kata kunci: Domba Temanggung; fenotip teropong; GWAS; signatures of selection; metabolomik; sifat produksi; proliferasi; penggaluran bibit; ketahanan pangan</w:t>
+        <w:t>Kata kunci: Domba Temanggung; fenotip teropong; GWAS; signatures of selection; metabolomik; sifat produksi; reproduksi; penggaluran bibit; ketahanan pangan</w:t>
       </w:r>
     </w:p>
     <w:p>
@@ -747,7 +747,7 @@
           <w:b w:val="0"/>
           <w:sz w:val="24"/>
         </w:rPr>
-        <w:t>Keywords: Temanggung sheep; periocular black phenotype; GWAS; signatures of selection; metabolomics; production traits; proliferation; breed/line development; food security</w:t>
+        <w:t>Keywords: Temanggung sheep; periocular black phenotype; GWAS; signatures of selection; metabolomics; production traits; reproduction; breed/line development; food security</w:t>
       </w:r>
     </w:p>
     <w:p>
@@ -797,7 +797,7 @@
           <w:b w:val="0"/>
           <w:sz w:val="24"/>
         </w:rPr>
-        <w:t>Penggaluran berbasis fenotip Teropong memiliki nilai strategis ganda: (1) menjaga kemurnian dan identitas genetik lokal; serta (2) membangun sistem seleksi bibit yang lebih terukur apabila fenotip identitas tersebut dapat dikaitkan dengan keunggulan produksi dan proliferasi. Namun, informasi genetik Domba Temanggung masih sangat terbatas. Studi awal berbasis mtDNA cytochrome b menunjukkan keragaman maternal rendah dan campuran haplogroup A/B, tetapi belum dapat dijadikan bukti diferensiasi genomik nuklear antar fenotip Teropong dan non-Teropong (Ridlo et al., 2026). Studi pada domba lokal Jawa umumnya masih fokus pada keragaman mtDNA antarrumpun (Ibrahim et al., 2021; Ibrahim et al., 2023), belum pada asosiasi genom–fenotip untuk penggaluran.</w:t>
+        <w:t>Penggaluran berbasis fenotip Teropong memiliki nilai strategis ganda: (1) menjaga kemurnian dan identitas genetik lokal; serta (2) membangun sistem seleksi bibit yang lebih terukur apabila fenotip identitas tersebut dapat dikaitkan dengan keunggulan produksi dan reproduksi. Namun, informasi genetik Domba Temanggung masih sangat terbatas. Studi awal berbasis mtDNA cytochrome b menunjukkan keragaman maternal rendah dan campuran haplogroup A/B, tetapi belum dapat dijadikan bukti diferensiasi genomik nuklear antar fenotip Teropong dan non-Teropong (Ridlo et al., 2026). Studi pada domba lokal Jawa umumnya masih fokus pada keragaman mtDNA antarrumpun (Ibrahim et al., 2021; Ibrahim et al., 2023), belum pada asosiasi genom–fenotip untuk penggaluran.</w:t>
       </w:r>
     </w:p>
     <w:p>
@@ -864,7 +864,7 @@
           <w:b w:val="0"/>
           <w:sz w:val="24"/>
         </w:rPr>
-        <w:t>2. Bagaimana struktur asosiasi genomik terhadap sifat produksi (bobot badan dan morfometri) serta parameter proliferasi pada populasi Domba Temanggung?</w:t>
+        <w:t>2. Bagaimana struktur asosiasi genomik terhadap sifat produksi (bobot badan dan morfometri) serta parameter reproduksi pada populasi Domba Temanggung?</w:t>
       </w:r>
     </w:p>
     <w:p>
@@ -878,7 +878,7 @@
           <w:b w:val="0"/>
           <w:sz w:val="24"/>
         </w:rPr>
-        <w:t>3. Apakah terdapat profil metabolit diferensial yang berkorelasi dengan fenotip Teropong, performa produksi, dan proliferasi?</w:t>
+        <w:t>3. Apakah terdapat profil metabolit diferensial yang berkorelasi dengan fenotip Teropong, performa produksi, dan reproduksi?</w:t>
       </w:r>
     </w:p>
     <w:p>
@@ -906,7 +906,7 @@
           <w:b w:val="0"/>
           <w:sz w:val="24"/>
         </w:rPr>
-        <w:t>Hipotesis solusi: Fenotip Teropong dikendalikan oleh lokus genetik terkait pigmen yang dapat dipetakan genomik; sifat produksi dan proliferasi memiliki komponen genetik aditif yang terukur; profil metabolom memberikan biomarker pelengkap; integrasi keduanya menghasilkan basis saintifik penggaluran Domba Temanggung Teropong sebagai bibit unggul pendukung ketahanan pangan.</w:t>
+        <w:t>Hipotesis solusi: Fenotip Teropong dikendalikan oleh lokus genetik terkait pigmen yang dapat dipetakan genomik; sifat produksi dan reproduksi memiliki komponen genetik aditif yang terukur; profil metabolom memberikan biomarker pelengkap; integrasi keduanya menghasilkan basis saintifik penggaluran Domba Temanggung Teropong sebagai bibit unggul pendukung ketahanan pangan.</w:t>
       </w:r>
     </w:p>
     <w:p>
@@ -973,7 +973,7 @@
           <w:b w:val="0"/>
           <w:sz w:val="24"/>
         </w:rPr>
-        <w:t>(1) Pertama kali mengintegrasikan genomik nuklear (GWAS + signatures of selection) dan metabolomik pada Domba Temanggung; (2) memperluas fokus dari identitas fenotip Teropong menuju paket sifat Teropong + sifat produksi + proliferasi sebagai kriteria penggaluran; (3) menghasilkan panel marka dan model seleksi yang dapat dihilirisasi sebagai instrumen bibit unggul lokal untuk ketahanan pangan.</w:t>
+        <w:t>(1) Pertama kali mengintegrasikan genomik nuklear (GWAS + signatures of selection) dan metabolomik pada Domba Temanggung; (2) memperluas fokus dari identitas fenotip Teropong menuju paket sifat Teropong + sifat produksi + reproduksi sebagai kriteria penggaluran; (3) menghasilkan panel marka dan model seleksi yang dapat dihilirisasi sebagai instrumen bibit unggul lokal untuk ketahanan pangan.</w:t>
       </w:r>
     </w:p>
     <w:p>
@@ -1012,7 +1012,7 @@
           <w:b w:val="0"/>
           <w:sz w:val="24"/>
         </w:rPr>
-        <w:t>Tujuan khusus: (1) menetapkan standar fenotipik Teropong, sifat produksi, dan proliferasi; (2) mengidentifikasi lokus/kandidat gen terkait fenotip Teropong melalui GWAS dan signatures of selection; (3) memetakan asosiasi genomik sifat bobot badan, morfometri, dan proliferasi; (4) mengarakterisasi profil metabolom terkait kelompok fenotip/performa; (5) menyusun panel marka dan model seleksi multi-omik; (6) menyusun rekomendasi teknis penggaluran bersama mitra daerah.</w:t>
+        <w:t>Tujuan khusus: (1) menetapkan standar fenotipik Teropong, sifat produksi, dan reproduksi; (2) mengidentifikasi lokus/kandidat gen terkait fenotip Teropong melalui GWAS dan signatures of selection; (3) memetakan asosiasi genomik sifat bobot badan, morfometri, dan reproduksi; (4) mengarakterisasi profil metabolom terkait kelompok fenotip/performa; (5) menyusun panel marka dan model seleksi multi-omik; (6) menyusun rekomendasi teknis penggaluran bersama mitra daerah.</w:t>
       </w:r>
     </w:p>
     <w:p>
@@ -1062,7 +1062,7 @@
           <w:b w:val="0"/>
           <w:sz w:val="24"/>
         </w:rPr>
-        <w:t>Riset bertolak dari kebutuhan membedakan dan mengembangkan galur Domba Temanggung Teropong secara ilmiah. Input berupa populasi Teropong vs non-Teropong beserta data sifat produksi dan proliferasi diproses melalui standardisasi fenotip, analisis genomik (struktur populasi, GWAS, signatures of selection: FST, π-ratio, iHS/XP-EHH, ROH), analisis metabolomik, serta integrasi multi-omik (gen → metabolit → fenotip). Output berupa lokus kandidat, panel marka, biomarker, model seleksi, dan rekomendasi penggaluran. Outcome yang diharapkan adalah penguatan sistem bibit lokal unggul yang meningkatkan produktivitas peternak dan berkontribusi pada penyediaan protein hewani nasional.</w:t>
+        <w:t>Riset bertolak dari kebutuhan membedakan dan mengembangkan galur Domba Temanggung Teropong secara ilmiah. Input berupa populasi Teropong vs non-Teropong beserta data sifat produksi dan reproduksi diproses melalui standardisasi fenotip, analisis genomik (struktur populasi, GWAS, signatures of selection: FST, π-ratio, iHS/XP-EHH, ROH), analisis metabolomik, serta integrasi multi-omik (gen → metabolit → fenotip). Output berupa lokus kandidat, panel marka, biomarker, model seleksi, dan rekomendasi penggaluran. Outcome yang diharapkan adalah penguatan sistem bibit lokal unggul yang meningkatkan produktivitas peternak dan berkontribusi pada penyediaan protein hewani nasional.</w:t>
       </w:r>
     </w:p>
     <w:p>
@@ -1076,7 +1076,7 @@
           <w:b w:val="0"/>
           <w:sz w:val="24"/>
         </w:rPr>
-        <w:t>Secara konseptual, fenotip Teropong berfungsi sebagai breed/line identity marker, sementara sifat produksi dan proliferasi menjadi economic merit. Genomik menjelaskan heritabilitas dan lokus kunci; metabolomik menjelaskan status fisiologis/metabolik yang relevan dengan performa. Integrasi keduanya mengurangi risiko seleksi hanya berbasis penampilan visual.</w:t>
+        <w:t>Secara konseptual, fenotip Teropong berfungsi sebagai breed/line identity marker, sementara sifat produksi dan reproduksi menjadi economic merit. Genomik menjelaskan heritabilitas dan lokus kunci; metabolomik menjelaskan status fisiologis/metabolik yang relevan dengan performa. Integrasi keduanya mengurangi risiko seleksi hanya berbasis penampilan visual.</w:t>
       </w:r>
     </w:p>
     <w:p>
@@ -1218,7 +1218,7 @@
           <w:b w:val="0"/>
           <w:sz w:val="24"/>
         </w:rPr>
-        <w:t>Desain kombinasi case–control untuk fenotip Teropong vs non-Teropong; asosiasi kuantitatif untuk bobot badan, morfometri, dan parameter proliferasi; serta multi-omik integratif (genomik + metabolomik).</w:t>
+        <w:t>Desain kombinasi case–control untuk fenotip Teropong vs non-Teropong; asosiasi kuantitatif untuk bobot badan, morfometri, dan parameter reproduksi; serta multi-omik integratif (genomik + metabolomik).</w:t>
       </w:r>
     </w:p>
     <w:p>
@@ -1282,7 +1282,7 @@
           <w:b w:val="0"/>
           <w:sz w:val="24"/>
         </w:rPr>
-        <w:t>B. Standardisasi fenotip: skor Teropong (kehadiran/intensitas/simetri lingkar hitam periokular + foto standar); sifat produksi (bobot badan dan morfometri: tinggi pundak, panjang badan, lingkar dada, dll.); proliferasi (litter size, jarak beranak, angka kebuntingan, survival anak, dan/atau indikator fisiologis terkait); kovariat umur, jenis kelamin, tipe kelahiran, lokasi/peternak, manajemen.</w:t>
+        <w:t>B. Standardisasi fenotip: skor Teropong (kehadiran/intensitas/simetri lingkar hitam periokular + foto standar); sifat produksi (bobot badan dan morfometri: tinggi pundak, panjang badan, lingkar dada, dll.); reproduksi (litter size, jarak beranak, angka kebuntingan, survival anak, dan/atau indikator fisiologis terkait); kovariat umur, jenis kelamin, tipe kelahiran, lokasi/peternak, manajemen.</w:t>
       </w:r>
     </w:p>
     <w:p>
@@ -1494,7 +1494,7 @@
           <w:b w:val="0"/>
           <w:sz w:val="24"/>
         </w:rPr>
-        <w:t>Tahun 2: GWAS fenotip Teropong; signatures of selection; GWAS produksi &amp; proliferasi; metabolomik tahap II &amp; integrasi; penyusunan panel marka dan pengajuan KI.</w:t>
+        <w:t>Tahun 2: GWAS fenotip Teropong; signatures of selection; GWAS produksi &amp; reproduksi; metabolomik tahap II &amp; integrasi; penyusunan panel marka dan pengajuan KI.</w:t>
       </w:r>
     </w:p>
     <w:p>
@@ -1828,7 +1828,7 @@
           <w:b w:val="0"/>
           <w:sz w:val="24"/>
         </w:rPr>
-        <w:t>Anggota 2: produksi &amp; reproduksi ruminansia kecil — fenotip produksi, proliferasi, sampling lapangan.</w:t>
+        <w:t>Anggota 2: produksi &amp; reproduksi ruminansia kecil — fenotip produksi, reproduksi, sampling lapangan.</w:t>
       </w:r>
     </w:p>
     <w:p>

</xml_diff>

<commit_message>
Phase methodology and RAB by trait focus toward breed proposal readiness.
Year 1 targets Teropong phenotype and production, Year 2 targets reproduction, and Year 3 integrates multi-omics outputs into a draft Temanggung sheep line/breed proposal dossier.

Co-authored-by: dr-psud <dr-psud@users.noreply.github.com>
</commit_message>
<xml_diff>
--- a/proposal-riim/PROPOSAL_RIIM_Domba_Temanggung.docx
+++ b/proposal-riim/PROPOSAL_RIIM_Domba_Temanggung.docx
@@ -517,7 +517,7 @@
           <w:b w:val="0"/>
           <w:sz w:val="24"/>
         </w:rPr>
-        <w:t>Tahun 1: 1 KTI jurnal internasional minimal Q3 under review; draft KI/paten sederhana; dataset fenotip–biobank; draft standar fenotip galur.</w:t>
+        <w:t>Tahun 1 (Teropong &amp; produksi): 1 KTI under review; draft KI panel marka Teropong–produksi; model/standar identitas–produksi.</w:t>
       </w:r>
     </w:p>
     <w:p>
@@ -530,7 +530,7 @@
           <w:b w:val="0"/>
           <w:sz w:val="24"/>
         </w:rPr>
-        <w:t>Tahun 2: KTI T1 accepted + 1 KTI baru under review; paten sederhana terdaftar; profil metabolom diferensial.</w:t>
+        <w:t>Tahun 2 (Reproduksi): KTI T1 accepted + 1 KTI baru under review (reproduksi); KI terdaftar; model seleksi reproduksi.</w:t>
       </w:r>
     </w:p>
     <w:p>
@@ -543,7 +543,7 @@
           <w:b w:val="0"/>
           <w:sz w:val="24"/>
         </w:rPr>
-        <w:t>Tahun 3: minimal 1 KTI published + 1 accepted + 1 under review; KI tambahan terdaftar; rekomendasi teknis penggaluran bibit unggul.</w:t>
+        <w:t>Tahun 3 (Usulan galur): minimal 1 KTI published + 1 accepted + 1 under review; KI tambahan; naskah usulan galur siap diajukan.</w:t>
       </w:r>
     </w:p>
     <w:p>
@@ -719,7 +719,7 @@
           <w:b w:val="0"/>
           <w:sz w:val="24"/>
         </w:rPr>
-        <w:t>Domba Temanggung merupakan plasma nutfah lokal Jawa Tengah dengan ciri khas fenotip teropong (warna bulu hitam melingkar di sekitar mata), yang saat ini diusulkan sebagai identitas galur/rumpun lokal unggul. Namun, diferensiasi galur Teropong versus non-Teropong masih bertumpu pada deskripsi fenotipik visual dan data genetik maternal terbatas (mtDNA), sehingga belum tersedia bukti genomik nuklear maupun profil metabolomik yang mendukung penggaluran berbasis sains. Riset ini mengintegrasikan pendekatan genomik (GWAS dan signatures of selection) serta metabolomik untuk mengarakterisasi fenotip Teropong, sifat produksi (bobot badan dan morfometri), serta reproduksi Domba Temanggung sebagai basis penggaluran bibit unggul. Populasi studi dirancang case–control dan kuantitatif pada Domba Temanggung di Kabupaten Temanggung dengan mitra DKPPP dan komunitas peternak. Kegiatan meliputi standardisasi fenotip, genotyping/whole-genome sequencing, asosiasi genom–fenotip, deteksi jejak seleksi, profil metabolom serum/jaringan terkait, serta integrasi multi-omik untuk menghasilkan panel marka dan model seleksi. Luaran utama mencakup publikasi jurnal internasional bereputasi, kekayaan intelektual (panel marka/paten sederhana), dan rekomendasi teknis penggaluran yang dapat memperkuat penyediaan bibit lokal unggul dan mendukung ketahanan pangan berbasis protein hewani.</w:t>
+        <w:t>Domba Temanggung merupakan plasma nutfah lokal Jawa Tengah dengan ciri khas fenotip teropong (warna bulu hitam melingkar di sekitar mata), yang saat ini diusulkan sebagai identitas galur/rumpun lokal unggul. Namun, diferensiasi galur Teropong versus non-Teropong masih bertumpu pada deskripsi fenotipik visual dan data genetik maternal terbatas (mtDNA), sehingga belum tersedia bukti genomik nuklear maupun profil metabolomik yang mendukung penggaluran berbasis sains. Riset ini mengintegrasikan pendekatan genomik (GWAS dan signatures of selection) serta metabolomik secara bertahap: Tahun 1 fokus fenotip Teropong dan sifat produksi; Tahun 2 fokus sifat reproduksi; Tahun 3 integrasi multi-omik untuk menghasilkan standar dan naskah usulan galur. Populasi studi berada di Kabupaten Temanggung bersama mitra DKPPP dan komunitas peternak. Luaran mencakup publikasi internasional bereputasi, kekayaan intelektual, model seleksi per tahap, serta dokumen usulan galur yang siap diajukan untuk memperkuat bibit lokal unggul dan ketahanan pangan nasional.</w:t>
       </w:r>
     </w:p>
     <w:p>
@@ -1012,7 +1012,7 @@
           <w:b w:val="0"/>
           <w:sz w:val="24"/>
         </w:rPr>
-        <w:t>Tujuan khusus: (1) menetapkan standar fenotipik Teropong, sifat produksi, dan reproduksi; (2) mengidentifikasi lokus/kandidat gen terkait fenotip Teropong melalui GWAS dan signatures of selection; (3) memetakan asosiasi genomik sifat bobot badan, morfometri, dan reproduksi; (4) mengarakterisasi profil metabolom terkait kelompok fenotip/performa; (5) menyusun panel marka dan model seleksi multi-omik; (6) menyusun rekomendasi teknis penggaluran bersama mitra daerah.</w:t>
+        <w:t>Tujuan khusus bertahap: (1) Tahun 1 menetapkan standar dan basis genomik–metabolomik fenotip Teropong serta sifat produksi; (2) Tahun 2 memetakan basis genomik–metabolomik sifat reproduksi dan menyusun model seleksi reproduksi; (3) Tahun 3 mengintegrasikan paket sifat Teropong + produksi + reproduksi menjadi panel marka, standar galur, dan naskah usulan galur yang siap diajukan.</w:t>
       </w:r>
     </w:p>
     <w:p>
@@ -1026,7 +1026,7 @@
           <w:b w:val="0"/>
           <w:sz w:val="24"/>
         </w:rPr>
-        <w:t>Sasaran: tersedianya data primer fenotipik–genomik–metabolomik terkurasi; kandidat marka genetik dan biomarker metabolit; draf standar galur Teropong dan model seleksi bibit; serta meningkatnya kesiapan hilirisasi menuju penetapan galur/rumpun dan sistem perbibitan lokal.</w:t>
+        <w:t>Sasaran: Tahun 1 tersedia database Teropong–produksi dan draf standar identitas–produksi; Tahun 2 tersedia parameter serta model seleksi reproduksi; Tahun 3 tersedia naskah usulan galur Domba Temanggung berbasis bukti multi-omik.</w:t>
       </w:r>
     </w:p>
     <w:p>
@@ -1062,7 +1062,7 @@
           <w:b w:val="0"/>
           <w:sz w:val="24"/>
         </w:rPr>
-        <w:t>Riset bertolak dari kebutuhan membedakan dan mengembangkan galur Domba Temanggung Teropong secara ilmiah. Input berupa populasi Teropong vs non-Teropong beserta data sifat produksi dan reproduksi diproses melalui standardisasi fenotip, analisis genomik (struktur populasi, GWAS, signatures of selection: FST, π-ratio, iHS/XP-EHH, ROH), analisis metabolomik, serta integrasi multi-omik (gen → metabolit → fenotip). Output berupa lokus kandidat, panel marka, biomarker, model seleksi, dan rekomendasi penggaluran. Outcome yang diharapkan adalah penguatan sistem bibit lokal unggul yang meningkatkan produktivitas peternak dan berkontribusi pada penyediaan protein hewani nasional.</w:t>
+        <w:t>Riset disusun berjenjang menuju usulan galur: Tahun 1 mengolah fenotip Teropong dan sifat produksi melalui GWAS, signatures of selection, dan metabolomik menjadi standar identitas–produksi; Tahun 2 memfokuskan pencatatan serta analisis genomik–metabolomik sifat reproduksi menjadi model seleksi reproduksi; Tahun 3 mengintegrasikan ketiga paket sifat menjadi panel marka final, standar galur, dan naskah usulan galur.</w:t>
       </w:r>
     </w:p>
     <w:p>
@@ -1076,7 +1076,7 @@
           <w:b w:val="0"/>
           <w:sz w:val="24"/>
         </w:rPr>
-        <w:t>Secara konseptual, fenotip Teropong berfungsi sebagai breed/line identity marker, sementara sifat produksi dan reproduksi menjadi economic merit. Genomik menjelaskan heritabilitas dan lokus kunci; metabolomik menjelaskan status fisiologis/metabolik yang relevan dengan performa. Integrasi keduanya mengurangi risiko seleksi hanya berbasis penampilan visual.</w:t>
+        <w:t>Secara konseptual, fenotip Teropong berfungsi sebagai breed/line identity marker, sementara sifat produksi dan reproduksi menjadi economic merit. Integrasi bertahap memastikan pada akhir Tahun 3 bukti ilmiah sudah memadai untuk usulan galur.</w:t>
       </w:r>
     </w:p>
     <w:p>
@@ -1126,7 +1126,7 @@
           <w:b w:val="0"/>
           <w:sz w:val="24"/>
         </w:rPr>
-        <w:t>Durasi usulan: 3 tahun (2026–2028).</w:t>
+        <w:t>Durasi usulan: 3 tahun (2026–2028), dengan fokus sifat berjenjang.</w:t>
       </w:r>
     </w:p>
     <w:p>
@@ -1140,7 +1140,7 @@
           <w:b w:val="0"/>
           <w:sz w:val="24"/>
         </w:rPr>
-        <w:t>Tahun 1 — Fondasi fenotip &amp; data omik: standar fenotip; koleksi sampel ≥100 ekor; genotyping tahap I; metabolom subset; draft manuskrip 1; draft KI.</w:t>
+        <w:t>Tahun 1 — Fenotip Teropong &amp; sifat produksi: standardisasi skor Teropong; bobot &amp; morfometri; genotyping; GWAS + signatures of selection; metabolomik identitas/produksi; KTI1 under review; draft KI; model identitas–produksi.</w:t>
       </w:r>
     </w:p>
     <w:p>
@@ -1154,7 +1154,7 @@
           <w:b w:val="0"/>
           <w:sz w:val="24"/>
         </w:rPr>
-        <w:t>Tahun 2 — Analisis genomik–metabolomik mendalam: hasil GWAS &amp; selection signatures; profil metabolom diferensial; model asosiasi awal; KTI T1 accepted; KTI baru under review; paten sederhana terdaftar.</w:t>
+        <w:t>Tahun 2 — Sifat reproduksi: pencatatan litter size, interval beranak, kebuntingan, survival; GWAS &amp; metabolomik reproduksi; model seleksi reproduksi; KTI2 under review; KI terdaftar.</w:t>
       </w:r>
     </w:p>
     <w:p>
@@ -1168,7 +1168,7 @@
           <w:b w:val="0"/>
           <w:sz w:val="24"/>
         </w:rPr>
-        <w:t>Tahun 3 — Integrasi, validasi &amp; hilirisasi: panel marka tervalidasi; model seleksi multi-omik; rekomendasi penggaluran; publikasi published; KI tambahan; diseminasi mitra.</w:t>
+        <w:t>Tahun 3 — Integrasi &amp; usulan galur: integrasi multi-omik; validasi panel marka; finalisasi standar galur; naskah usulan galur siap diajukan; KTI3 under review; KI tambahan.</w:t>
       </w:r>
     </w:p>
     <w:p>
@@ -1182,7 +1182,7 @@
           <w:b w:val="0"/>
           <w:sz w:val="24"/>
         </w:rPr>
-        <w:t>Produk akhir: Sistem penggaluran bibit Domba Temanggung berbasis genomik–metabolomik (standar fenotip + panel marka + model seleksi + rekomendasi kebijakan/teknis) untuk mendukung ketahanan pangan.</w:t>
+        <w:t>Produk akhir: Naskah usulan galur Domba Temanggung berbasis bukti genomik–metabolomik pada fenotip Teropong, sifat produksi, dan reproduksi.</w:t>
       </w:r>
     </w:p>
     <w:p>
@@ -1218,7 +1218,7 @@
           <w:b w:val="0"/>
           <w:sz w:val="24"/>
         </w:rPr>
-        <w:t>Desain kombinasi case–control untuk fenotip Teropong vs non-Teropong; asosiasi kuantitatif untuk bobot badan, morfometri, dan parameter reproduksi; serta multi-omik integratif (genomik + metabolomik).</w:t>
+        <w:t>Desain bertahap: Tahun 1 case–control Teropong vs non-Teropong dan kuantitatif produksi; Tahun 2 kuantitatif reproduksi; Tahun 3 integrasi multi-omik untuk standar dan usulan galur.</w:t>
       </w:r>
     </w:p>
     <w:p>
@@ -1243,7 +1243,7 @@
           <w:b w:val="0"/>
           <w:sz w:val="24"/>
         </w:rPr>
-        <w:t>Lokasi: Kabupaten Temanggung, Jawa Tengah. Mitra: DKPPP Temanggung dan komunitas DSL/peternak. Target sampel genomik 100–150 ekor, seimbang Teropong : non-Teropong, dengan penambahan bertahap sesuai tahun pendanaan. Subset metabolomik 30–50 ekor terpilih berdasarkan kontras fenotip/performa, distandardisasi sampling.</w:t>
+        <w:t>Lokasi: Kabupaten Temanggung. Mitra: DKPPP dan DSL. Genomik kumulatif 100–150 ekor (T1 genotyping inti ±100–120 ekor; T2 pendalaman betina produktif; T3 validasi panel terbatas). Metabolomik 30–50 ekor total (T1 Teropong/produksi; T2 status reproduksi).</w:t>
       </w:r>
     </w:p>
     <w:p>
@@ -1268,7 +1268,7 @@
           <w:b w:val="0"/>
           <w:sz w:val="24"/>
         </w:rPr>
-        <w:t>A. Klirens etik dan perizinan sebelum sampling hewan sesuai Peraturan BRIN.</w:t>
+        <w:t>A. Persiapan: klirens etik, MoU mitra, SOP, DMP.</w:t>
       </w:r>
     </w:p>
     <w:p>
@@ -1282,7 +1282,7 @@
           <w:b w:val="0"/>
           <w:sz w:val="24"/>
         </w:rPr>
-        <w:t>B. Standardisasi fenotip: skor Teropong (kehadiran/intensitas/simetri lingkar hitam periokular + foto standar); sifat produksi (bobot badan dan morfometri: tinggi pundak, panjang badan, lingkar dada, dll.); reproduksi (litter size, jarak beranak, angka kebuntingan, survival anak, dan/atau indikator fisiologis terkait); kovariat umur, jenis kelamin, tipe kelahiran, lokasi/peternak, manajemen.</w:t>
+        <w:t>B. Tahun 1 (Teropong &amp; produksi): skor Teropong; bobot &amp; morfometri; sampling DNA/serum; genotyping; GWAS dan signatures of selection Teropong–produksi; metabolomik tahap I; draf standar identitas–produksi, KTI1, draft KI.</w:t>
       </w:r>
     </w:p>
     <w:p>
@@ -1296,7 +1296,7 @@
           <w:b w:val="0"/>
           <w:sz w:val="24"/>
         </w:rPr>
-        <w:t>C. Sampling biologis: darah EDTA untuk DNA; serum/plasma untuk metabolomik; subset jaringan/swab kulit periokular opsional; cold-chain dan kurasi DMP.</w:t>
+        <w:t>C. Tahun 2 (Reproduksi): pencatatan litter size, jarak beranak, kebuntingan, survival (+ USG bila memungkinkan); GWAS reproduksi; metabolomik tahap II; model seleksi reproduksi; KTI2 dan pendaftaran KI.</w:t>
       </w:r>
     </w:p>
     <w:p>
@@ -1310,49 +1310,7 @@
           <w:b w:val="0"/>
           <w:sz w:val="24"/>
         </w:rPr>
-        <w:t>D. Analisis genomik: ekstraksi DNA &amp; QC; genotyping SNP chip densitas menengah–tinggi dan/atau low-coverage WGS + imputation; QC genotip; GWAS model mixed linear (GRM/kinship) untuk sifat biner dan kuantitatif; signatures of selection (FST, π-ratio, iHS, XP-EHH, ROH); anotasi gen kandidat dan enrichment jalur.</w:t>
-      </w:r>
-    </w:p>
-    <w:p>
-      <w:pPr>
-        <w:spacing w:after="120" w:line="276" w:lineRule="auto"/>
-        <w:jc w:val="both"/>
-      </w:pPr>
-      <w:r>
-        <w:rPr>
-          <w:rFonts w:ascii="Times New Roman" w:hAnsi="Times New Roman"/>
-          <w:b w:val="0"/>
-          <w:sz w:val="24"/>
-        </w:rPr>
-        <w:t>E. Analisis metabolomik: LC-MS/MS untargeted (± targeted); PCA/OPLS-DA; identifikasi metabolit dan pathway enrichment; korelasi dengan fenotip/genotipe (mGWAS/mQTL pada subset bila memadai).</w:t>
-      </w:r>
-    </w:p>
-    <w:p>
-      <w:pPr>
-        <w:spacing w:after="120" w:line="276" w:lineRule="auto"/>
-        <w:jc w:val="both"/>
-      </w:pPr>
-      <w:r>
-        <w:rPr>
-          <w:rFonts w:ascii="Times New Roman" w:hAnsi="Times New Roman"/>
-          <w:b w:val="0"/>
-          <w:sz w:val="24"/>
-        </w:rPr>
-        <w:t>F. Integrasi multi-omik: network gen–metabolit–fenotip; panel marka SNP prioritas; model seleksi/indeks genomic breeding value sederhana; validasi internal dan validasi terbatas tahun akhir.</w:t>
-      </w:r>
-    </w:p>
-    <w:p>
-      <w:pPr>
-        <w:spacing w:after="120" w:line="276" w:lineRule="auto"/>
-        <w:jc w:val="both"/>
-      </w:pPr>
-      <w:r>
-        <w:rPr>
-          <w:rFonts w:ascii="Times New Roman" w:hAnsi="Times New Roman"/>
-          <w:b w:val="0"/>
-          <w:sz w:val="24"/>
-        </w:rPr>
-        <w:t>G. Hilirisasi: draf standar galur, FGD mitra, rekomendasi teknis, pengajuan KI, dan publikasi.</w:t>
+        <w:t>D. Tahun 3 (Usulan galur): integrasi gen–metabolit–fenotip lintas sifat; panel marka final; validasi terbatas; finalisasi standar galur; penyusunan naskah usulan galur bersama mitra; KTI3 dan KI tambahan.</w:t>
       </w:r>
     </w:p>
     <w:p>
@@ -1377,7 +1335,7 @@
           <w:b w:val="0"/>
           <w:sz w:val="24"/>
         </w:rPr>
-        <w:t>Analisis menggunakan R/PLINK/GCTA/GEMMA/VCFtools dan perangkat metabolomik standar. Model linier campuran memasukkan efek tetap (sex, age class, farm) dan efek random genetik aditif. Mitigasi risiko mencakup standardisasi protokol sampling, koreksi farm/batch, desain sampling menyebar, power simulation, serta standardisasi waktu sampling metabolom.</w:t>
+        <w:t>Analisis menggunakan R/PLINK/GCTA/GEMMA/VCFtools dan perangkat metabolomik standar. Model linier campuran memasukkan efek tetap (sex, age/parity class, farm) dan efek random genetik aditif. Mitigasi mencakup form pencatatan reproduksi sejak T1, sampling menyebar, standardisasi waktu sampling metabolom, serta FGD bertahap dengan pemda sejak T2 untuk kesiapan naskah usulan galur.</w:t>
       </w:r>
     </w:p>
     <w:p>
@@ -1402,7 +1360,7 @@
           <w:b w:val="0"/>
           <w:sz w:val="24"/>
         </w:rPr>
-        <w:t>Riset diusulkan selama 3 (tiga) tahun periode pendanaan (2026–2028), dengan evaluasi tahunan sesuai ketentuan RIIM Kompetisi.</w:t>
+        <w:t>Riset diusulkan selama 3 (tiga) tahun periode pendanaan (2026–2028). Tahun 3 diarahkan agar hasil riset siap digunakan untuk usulan galur.</w:t>
       </w:r>
     </w:p>
     <w:p>
@@ -1427,7 +1385,7 @@
           <w:b w:val="0"/>
           <w:sz w:val="24"/>
         </w:rPr>
-        <w:t>Tahun 1: 1 publikasi minimal Q3 under review; draft paten sederhana/KI; database fenotip ≥100 ekor + biobank; draft standar fenotip galur.</w:t>
+        <w:t>Tahun 1 (Teropong &amp; produksi): 1 KTI under review; draft KI panel Teropong–produksi; model/standar identitas–produksi; database ≥100 ekor + biobank.</w:t>
       </w:r>
     </w:p>
     <w:p>
@@ -1441,7 +1399,7 @@
           <w:b w:val="0"/>
           <w:sz w:val="24"/>
         </w:rPr>
-        <w:t>Tahun 2: 1 KTI accepted (akumulasi) + 1 KTI baru under review; paten sederhana terdaftar; laporan profil metabolom diferensial.</w:t>
+        <w:t>Tahun 2 (Reproduksi): 1 KTI accepted (akumulasi) + 1 KTI baru under review; KI terdaftar; model seleksi reproduksi.</w:t>
       </w:r>
     </w:p>
     <w:p>
@@ -1455,7 +1413,7 @@
           <w:b w:val="0"/>
           <w:sz w:val="24"/>
         </w:rPr>
-        <w:t>Tahun 3: minimal 1 KTI published + 1 accepted + 1 under review; KI tambahan terdaftar; dokumen rekomendasi teknis penggaluran bibit unggul untuk mitra/pemda.</w:t>
+        <w:t>Tahun 3 (Usulan galur): minimal 1 KTI published + 1 accepted + 1 under review; KI tambahan terdaftar; naskah usulan galur siap diajukan bersama mitra ke otoritas terkait.</w:t>
       </w:r>
     </w:p>
     <w:p>
@@ -1480,7 +1438,7 @@
           <w:b w:val="0"/>
           <w:sz w:val="24"/>
         </w:rPr>
-        <w:t>Tahun 1: persiapan &amp; etik; survei &amp; sampling fenotip; koleksi sampel; ekstraksi DNA &amp; genotyping; metabolomik tahap I; analisis struktur populasi dan manuskrip 1.</w:t>
+        <w:t>Tahun 1: persiapan &amp; etik; fenotip Teropong &amp; produksi; sampling; genotyping; GWAS/selection signatures Teropong–produksi; metabolomik T1; standar &amp; KTI1/draft KI.</w:t>
       </w:r>
     </w:p>
     <w:p>
@@ -1494,7 +1452,7 @@
           <w:b w:val="0"/>
           <w:sz w:val="24"/>
         </w:rPr>
-        <w:t>Tahun 2: GWAS fenotip Teropong; signatures of selection; GWAS produksi &amp; reproduksi; metabolomik tahap II &amp; integrasi; penyusunan panel marka dan pengajuan KI.</w:t>
+        <w:t>Tahun 2: pencatatan sifat reproduksi; GWAS reproduksi; metabolomik T2; model seleksi reproduksi; KTI2 &amp; pendaftaran KI.</w:t>
       </w:r>
     </w:p>
     <w:p>
@@ -1508,7 +1466,7 @@
           <w:b w:val="0"/>
           <w:sz w:val="24"/>
         </w:rPr>
-        <w:t>Tahun 3: validasi marka &amp; model seleksi; finalisasi standar galur dan FGD mitra; publikasi, diseminasi, monev, dan pelaporan.</w:t>
+        <w:t>Tahun 3: integrasi multi-omik; validasi panel marka; penyusunan naskah usulan galur &amp; FGD mitra; publikasi, diseminasi, monev.</w:t>
       </w:r>
     </w:p>
     <w:p>
@@ -1533,7 +1491,7 @@
           <w:b w:val="0"/>
           <w:sz w:val="24"/>
         </w:rPr>
-        <w:t>Pendanaan mengikuti prinsip kesetaraan output: 1 keluaran ≈ Rp150–200 juta. Paket tahunan 1 KTI + 1 KI + 1 model/implementasi dianggarkan pada rentang Rp300–450 juta/tahun.</w:t>
+        <w:t>Pendanaan berbasis kesetaraan output: 1 keluaran ≈ Rp150–200 juta; paket 1 KTI + 1 KI + 1 model/implementasi ≈ Rp300–450 juta/tahun. Belanja non-personil mengikuti fokus sifat tiap tahun.</w:t>
       </w:r>
     </w:p>
     <w:p>
@@ -1547,7 +1505,7 @@
           <w:b w:val="0"/>
           <w:sz w:val="24"/>
         </w:rPr>
-        <w:t>Proporsi mengikuti Juknis RIIM: Biaya Langsung Personil ≤25%; Biaya Langsung Non-Personil ≥70%; Biaya Tidak Langsung ≤5%.</w:t>
+        <w:t>Proporsi Juknis RIIM: Personil ≤25%; Non-personil ≥70%; Tidak langsung ≤5%.</w:t>
       </w:r>
     </w:p>
     <w:p>
@@ -1561,7 +1519,7 @@
           <w:b w:val="0"/>
           <w:sz w:val="24"/>
         </w:rPr>
-        <w:t>Tahun 1 Rp400.000.000 (Personil 90 jt; Non-personil 290 jt; Tidak langsung 20 jt) untuk 1 KTI under review + 1 draft KI + 1 draft model.</w:t>
+        <w:t>Tahun 1 Rp400.000.000 (Personil 90 jt; Non-personil 290 jt; Tidak langsung 20 jt) — genotyping/fenotip Teropong–produksi; metabolomik T1; KTI + draft KI + model identitas–produksi.</w:t>
       </w:r>
     </w:p>
     <w:p>
@@ -1575,7 +1533,7 @@
           <w:b w:val="0"/>
           <w:sz w:val="24"/>
         </w:rPr>
-        <w:t>Tahun 2 Rp450.000.000 (Personil 100 jt; Non-personil 328 jt; Tidak langsung 22 jt) untuk 1 KTI baru under review + 1 KI terdaftar + 1 model seleksi.</w:t>
+        <w:t>Tahun 2 Rp450.000.000 (Personil 100 jt; Non-personil 328 jt; Tidak langsung 22 jt) — pencatatan/USG reproduksi; GWAS &amp; metabolomik reproduksi; KTI + KI terdaftar + model seleksi reproduksi.</w:t>
       </w:r>
     </w:p>
     <w:p>
@@ -1589,7 +1547,7 @@
           <w:b w:val="0"/>
           <w:sz w:val="24"/>
         </w:rPr>
-        <w:t>Tahun 3 Rp400.000.000 (Personil 90 jt; Non-personil 290 jt; Tidak langsung 20 jt) untuk 1 KTI baru under review + 1 KI tambahan + 1 implementasi/rekomendasi teknis.</w:t>
+        <w:t>Tahun 3 Rp400.000.000 (Personil 90 jt; Non-personil 290 jt; Tidak langsung 20 jt) — validasi panel; standar galur; naskah usulan galur; KTI + KI tambahan + implementasi usulan galur.</w:t>
       </w:r>
     </w:p>
     <w:p>
@@ -1603,7 +1561,7 @@
           <w:b w:val="0"/>
           <w:sz w:val="24"/>
         </w:rPr>
-        <w:t>Total usulan Rp1.250.000.000. Status accepted/published KTI tahun sebelumnya merupakan akumulasi kewajiban RIIM dan tidak dihitung sebagai keluaran baru untuk penambahan plafon dana. RAB detail per item dilampirkan pada lembar RAB resmi sistem Pendanaan Risnov, termasuk pemisahan harga pokok dan pajak sesuai status PKP/Non-PKP institusi.</w:t>
+        <w:t>Total usulan Rp1.250.000.000. RAB detail per item dilampirkan pada lembar RAB resmi sistem Pendanaan Risnov.</w:t>
       </w:r>
     </w:p>
     <w:p>

</xml_diff>

<commit_message>
Strengthen introduction on rumpun proposal status and Teropong line value.
Clarify ongoing breed recognition process, Teropong vs non-Teropong description, need for dedicated line development, and potential economic premium for farmers.

Co-authored-by: dr-psud <dr-psud@users.noreply.github.com>
</commit_message>
<xml_diff>
--- a/proposal-riim/PROPOSAL_RIIM_Domba_Temanggung.docx
+++ b/proposal-riim/PROPOSAL_RIIM_Domba_Temanggung.docx
@@ -783,7 +783,7 @@
           <w:b w:val="0"/>
           <w:sz w:val="24"/>
         </w:rPr>
-        <w:t>Ketahanan pangan nasional menuntut peningkatan ketersediaan protein hewani yang berkelanjutan, efisien, dan berbasis sumberdaya genetik lokal. Domba merupakan komoditas strategis bagi peternak rakyat karena siklus produksi relatif cepat, modal relatif terjangkau, serta adaptif pada sistem pemeliharaan ekstensif–semi intensif. Di Kabupaten Temanggung, Domba Temanggung (sering disebut Domba Teropong) memiliki ciri khas pola bulu hitam di sekitar mata menyerupai kacamata/teropong, disertai karakter morfologi lokal lain (ekor tipis berbentuk V/ngotes, tanduk melengkung, telinga semi menggantung). Populasi diperkirakan sekitar 20.000 ekor dan menjadi identitas peternakan daerah, termasuk melalui komunitas Domba Seni Lokal (DSL). Pemerintah daerah telah menginisiasi pengajuan penetapan sebagai rumpun lokal asli untuk memperkuat legalitas dan standar genetik.</w:t>
+        <w:t>Ketahanan pangan nasional menuntut peningkatan ketersediaan protein hewani yang berkelanjutan, efisien, dan berbasis sumberdaya genetik lokal. Domba merupakan komoditas strategis bagi peternak rakyat karena siklus produksi relatif cepat, modal relatif terjangkau, serta adaptif pada sistem pemeliharaan ekstensif–semi intensif. Di Kabupaten Temanggung, Domba Temanggung menjadi identitas peternakan daerah dengan populasi diperkirakan sekitar 20.000 ekor, termasuk yang dipelihara komunitas Domba Seni Lokal (DSL).</w:t>
       </w:r>
     </w:p>
     <w:p>
@@ -797,7 +797,21 @@
           <w:b w:val="0"/>
           <w:sz w:val="24"/>
         </w:rPr>
-        <w:t>Penggaluran berbasis fenotip Teropong memiliki nilai strategis ganda: (1) menjaga kemurnian dan identitas genetik lokal; serta (2) membangun sistem seleksi bibit yang lebih terukur apabila fenotip identitas tersebut dapat dikaitkan dengan keunggulan produksi dan reproduksi. Namun, informasi genetik Domba Temanggung masih sangat terbatas. Studi awal berbasis mtDNA cytochrome b menunjukkan keragaman maternal rendah dan campuran haplogroup A/B, tetapi belum dapat dijadikan bukti diferensiasi genomik nuklear antar fenotip Teropong dan non-Teropong (Ridlo et al., 2026). Studi pada domba lokal Jawa umumnya masih fokus pada keragaman mtDNA antarrumpun (Ibrahim et al., 2021; Ibrahim et al., 2023), belum pada asosiasi genom–fenotip untuk penggaluran.</w:t>
+        <w:t>Saat ini, Domba Temanggung sedang dalam proses pengusulan sebagai rumpun lokal kepada otoritas terkait untuk memperkuat legalitas dan standar genetik plasma nutfah daerah (DKPPP Temanggung, 2026). Dalam deskripsi populasinya, terdapat diferensiasi fenotip Teropong dan non-Teropong. Domba Temanggung fenotip Teropong dicirikan oleh warna bulu hitam melingkar di sekitar mata sehingga tampak seperti memakai kacamata/teropong, yang sering disertai karakter morfologi lokal lain (ekor tipis berbentuk V/ngotes, tanduk melengkung, telinga semi menggantung). Sebaliknya, individu non-Teropong tidak menampilkan pola pigmen periokular tersebut secara khas. Diferensiasi ini penting karena menjadi penanda identitas visual yang membedakan galur potensial di dalam populasi Domba Temanggung.</w:t>
+      </w:r>
+    </w:p>
+    <w:p>
+      <w:pPr>
+        <w:spacing w:after="120" w:line="276" w:lineRule="auto"/>
+        <w:jc w:val="both"/>
+      </w:pPr>
+      <w:r>
+        <w:rPr>
+          <w:rFonts w:ascii="Times New Roman" w:hAnsi="Times New Roman"/>
+          <w:b w:val="0"/>
+          <w:sz w:val="24"/>
+        </w:rPr>
+        <w:t>Upaya penggaluran khusus terhadap Domba Temanggung yang memiliki fenotip Teropong diperlukan agar identitas genetik lokal tidak tercampur secara tidak terarah dengan individu non-Teropong, sekaligus membangun sistem seleksi bibit yang terukur pada sifat produksi dan reproduksi. Penggaluran berbasis fenotip Teropong juga berpotensi meningkatkan nilai jual/ekonomi ternak dan bibit di tingkat peternak, karena keunikan fenotip yang terstandar dapat memperkuat daya saing pasar, diferensiasi produk lokal, dan premium harga bibit unggul. Namun, informasi genetik Domba Temanggung masih sangat terbatas. Studi awal berbasis mtDNA cytochrome b menunjukkan keragaman maternal rendah dan campuran haplogroup A/B, tetapi belum dapat dijadikan bukti diferensiasi genomik nuklear antar fenotip Teropong dan non-Teropong (Ridlo et al., 2026). Studi pada domba lokal Jawa umumnya masih fokus pada keragaman mtDNA antarrumpun (Ibrahim et al., 2021; Ibrahim et al., 2023), belum pada asosiasi genom–fenotip untuk penggaluran.</w:t>
       </w:r>
     </w:p>
     <w:p>
@@ -1101,7 +1115,7 @@
           <w:b w:val="0"/>
           <w:sz w:val="24"/>
         </w:rPr>
-        <w:t>Nilai strategis meliputi: penguatan kedaulatan pangan berbasis plasma nutfah lokal; konservasi sekaligus pemanfaatan ekonomi galur lokal; dukungan evidence-based policy bagi penetapan galur/rumpun; hilirisasi panel marka dan protokol seleksi; serta peningkatan daya saing peternak rakyat Temanggung melalui bibit bermutu dan identitas produk lokal.</w:t>
+        <w:t>Nilai strategis meliputi: penguatan kedaulatan pangan berbasis plasma nutfah lokal; konservasi sekaligus pemanfaatan ekonomi galur lokal; dukungan evidence-based policy bagi penetapan galur/rumpun; hilirisasi panel marka dan protokol seleksi; serta peningkatan nilai jual/ekonomi bibit dan ternak Domba Temanggung fenotip Teropong melalui diferensiasi produk lokal dan premium harga bibit unggul.</w:t>
       </w:r>
     </w:p>
     <w:p>

</xml_diff>